<commit_message>
0.2.8 — endnote modes (native + body) with a Notes heading and inline citations; auto-numbering and TOC-depth controls; include-bibliography flag; DOCX/ODT notes pipeline and undefined-style fixes; release plumbing
</commit_message>
<xml_diff>
--- a/sw-export-templates/document.docx
+++ b/sw-export-templates/document.docx
@@ -2687,6 +2687,47 @@
     <w:basedOn w:val="TOCHeading"/>
     <w:qFormat/>
     <w:rsid w:val="00396F2B"/>
+  </w:style>
+  <w:style w:type="paragraph" w:styleId="EndnoteText">
+    <w:name w:val="endnote text"/>
+    <w:basedOn w:val="Normal"/>
+    <w:link w:val="EndnoteTextChar"/>
+    <w:uiPriority w:val="99"/>
+    <w:semiHidden/>
+    <w:unhideWhenUsed/>
+    <w:rsid w:val="00123E5F"/>
+    <w:pPr>
+      <w:spacing w:after="0" w:line="240" w:lineRule="auto"/>
+    </w:pPr>
+    <w:rPr>
+      <w:sz w:val="20"/>
+      <w:szCs w:val="20"/>
+    </w:rPr>
+  </w:style>
+  <w:style w:type="character" w:customStyle="1" w:styleId="EndnoteTextChar">
+    <w:name w:val="Endnote Text Char"/>
+    <w:basedOn w:val="DefaultParagraphFont"/>
+    <w:link w:val="EndnoteText"/>
+    <w:uiPriority w:val="99"/>
+    <w:semiHidden/>
+    <w:rsid w:val="00123E5F"/>
+    <w:rPr>
+      <w:rFonts w:ascii="Noto Serif" w:hAnsi="Noto Serif" w:cs="Noto Naskh Arabic"/>
+      <w:sz w:val="20"/>
+      <w:szCs w:val="20"/>
+      <w:lang w:val="en-US"/>
+    </w:rPr>
+  </w:style>
+  <w:style w:type="character" w:styleId="EndnoteReference">
+    <w:name w:val="endnote reference"/>
+    <w:basedOn w:val="DefaultParagraphFont"/>
+    <w:uiPriority w:val="99"/>
+    <w:semiHidden/>
+    <w:unhideWhenUsed/>
+    <w:rsid w:val="00123E5F"/>
+    <w:rPr>
+      <w:vertAlign w:val="superscript"/>
+    </w:rPr>
   </w:style>
 </w:styles>
 </file>

</xml_diff>

<commit_message>
0.5.2 — remove the Zotero picker, 68% smaller bundle, manifest + review fixes
- Remove the "Import literature notes from Zotero…" command and zoteroPicker:
  Zotero's picker searches every library, including ones the plugin does not
  load, so it could create citations nothing could resolve.
- Bundle 10.5 MB -> 3.4 MB (minified release builds; export templates and
  documentation screenshots stored at sensible sizes).
- Manifest: description no longer names Obsidian; authorUrl points at the
  profile. Release assets now carry a build-provenance attestation.
- Move the Add Notes / Import dialogs' remembered state from localStorage to
  the plugin data file.
- Pass the community directory's linter with 0 errors (eslint 9 +
  eslint-plugin-obsidianmd, matching the review's severity split); remove dead
  code left by the ZotLit interop removal.
</commit_message>
<xml_diff>
--- a/sw-export-templates/document.docx
+++ b/sw-export-templates/document.docx
@@ -422,6 +422,9 @@
     <w:p>
       <w:pPr>
         <w:pStyle w:val="BodyText"/>
+        <w:rPr>
+          <w:lang w:val="fr-FR"/>
+        </w:rPr>
       </w:pPr>
       <w:r>
         <w:t xml:space="preserve">Body Text. Body Text Char. </w:t>
@@ -429,21 +432,42 @@
       <w:r>
         <w:rPr>
           <w:rStyle w:val="VerbatimChar"/>
+          <w:lang w:val="fr-FR"/>
         </w:rPr>
         <w:t>Verbatim Char</w:t>
       </w:r>
       <w:r>
+        <w:rPr>
+          <w:lang w:val="fr-FR"/>
+        </w:rPr>
         <w:t xml:space="preserve">. </w:t>
       </w:r>
-      <w:hyperlink r:id="rId7">
-        <w:r>
-          <w:rPr>
-            <w:rStyle w:val="Hyperlink"/>
-          </w:rPr>
-          <w:t>Hyperlink</w:t>
-        </w:r>
-      </w:hyperlink>
-      <w:r>
+      <w:r>
+        <w:fldChar w:fldCharType="begin"/>
+      </w:r>
+      <w:r>
+        <w:rPr>
+          <w:lang w:val="fr-FR"/>
+        </w:rPr>
+        <w:instrText>HYPERLINK "http://example.com" \h</w:instrText>
+      </w:r>
+      <w:r>
+        <w:fldChar w:fldCharType="separate"/>
+      </w:r>
+      <w:r>
+        <w:rPr>
+          <w:rStyle w:val="Hyperlink"/>
+          <w:lang w:val="fr-FR"/>
+        </w:rPr>
+        <w:t>Hyperlink</w:t>
+      </w:r>
+      <w:r>
+        <w:fldChar w:fldCharType="end"/>
+      </w:r>
+      <w:r>
+        <w:rPr>
+          <w:lang w:val="fr-FR"/>
+        </w:rPr>
         <w:t>. Footnote.</w:t>
       </w:r>
       <w:r>
@@ -458,7 +482,13 @@
         <w:pStyle w:val="Bibliographicreference-body"/>
       </w:pPr>
       <w:r>
-        <w:t xml:space="preserve">Bourdieu, Pierre. 1984. </w:t>
+        <w:rPr>
+          <w:lang w:val="fr-FR"/>
+        </w:rPr>
+        <w:t xml:space="preserve">Bourdieu, Pierre. </w:t>
+      </w:r>
+      <w:r>
+        <w:t xml:space="preserve">1984. </w:t>
       </w:r>
       <w:r>
         <w:rPr>
@@ -609,9 +639,9 @@
           <w:noProof/>
         </w:rPr>
         <w:drawing>
-          <wp:inline distT="0" distB="0" distL="0" distR="0" wp14:anchorId="3A1AF2B0" wp14:editId="3FB01BC3">
-            <wp:extent cx="5943600" cy="5188585"/>
-            <wp:effectExtent l="0" t="0" r="0" b="5715"/>
+          <wp:inline distT="0" distB="0" distL="0" distR="0" wp14:anchorId="3A1AF2B0" wp14:editId="640A543E">
+            <wp:extent cx="2061275" cy="1314063"/>
+            <wp:effectExtent l="0" t="0" r="0" b="0"/>
             <wp:docPr id="1058594678" name="Picture 1"/>
             <wp:cNvGraphicFramePr>
               <a:graphicFrameLocks xmlns:a="http://schemas.openxmlformats.org/drawingml/2006/main" noChangeAspect="1"/>
@@ -623,20 +653,35 @@
                     <pic:cNvPr id="1058594678" name=""/>
                     <pic:cNvPicPr/>
                   </pic:nvPicPr>
-                  <pic:blipFill>
-                    <a:blip r:embed="rId8"/>
+                  <pic:blipFill rotWithShape="1">
+                    <a:blip r:embed="rId7" cstate="email">
+                      <a:extLst>
+                        <a:ext uri="{28A0092B-C50C-407E-A947-70E740481C1C}">
+                          <a14:useLocalDpi xmlns:a14="http://schemas.microsoft.com/office/drawing/2010/main"/>
+                        </a:ext>
+                      </a:extLst>
+                    </a:blip>
+                    <a:srcRect/>
                     <a:stretch>
                       <a:fillRect/>
                     </a:stretch>
                   </pic:blipFill>
-                  <pic:spPr>
+                  <pic:spPr bwMode="auto">
                     <a:xfrm>
                       <a:off x="0" y="0"/>
-                      <a:ext cx="5943600" cy="5188585"/>
+                      <a:ext cx="2097909" cy="1337417"/>
                     </a:xfrm>
                     <a:prstGeom prst="rect">
                       <a:avLst/>
                     </a:prstGeom>
+                    <a:ln>
+                      <a:noFill/>
+                    </a:ln>
+                    <a:extLst>
+                      <a:ext uri="{53640926-AAD7-44D8-BBD7-CCE9431645EC}">
+                        <a14:shadowObscured xmlns:a14="http://schemas.microsoft.com/office/drawing/2010/main"/>
+                      </a:ext>
+                    </a:extLst>
                   </pic:spPr>
                 </pic:pic>
               </a:graphicData>
@@ -710,7 +755,6 @@
         <w:pStyle w:val="ListNumber"/>
       </w:pPr>
       <w:r>
-        <w:lastRenderedPageBreak/>
         <w:t>Numbered list item</w:t>
       </w:r>
     </w:p>
@@ -823,6 +867,7 @@
         <w:pStyle w:val="callout"/>
       </w:pPr>
       <w:r>
+        <w:lastRenderedPageBreak/>
         <w:t xml:space="preserve">This is a note callout. It spans more than one line. This is a note callout. It spans more than one line. This is a note callout. It spans more than one line. This is a note callout. It spans more than one line. </w:t>
       </w:r>
     </w:p>
@@ -942,12 +987,12 @@
       </w:pPr>
     </w:p>
     <w:sectPr>
-      <w:headerReference w:type="even" r:id="rId9"/>
-      <w:headerReference w:type="default" r:id="rId10"/>
-      <w:footerReference w:type="even" r:id="rId11"/>
-      <w:footerReference w:type="default" r:id="rId12"/>
-      <w:headerReference w:type="first" r:id="rId13"/>
-      <w:footerReference w:type="first" r:id="rId14"/>
+      <w:headerReference w:type="even" r:id="rId8"/>
+      <w:headerReference w:type="default" r:id="rId9"/>
+      <w:footerReference w:type="even" r:id="rId10"/>
+      <w:footerReference w:type="default" r:id="rId11"/>
+      <w:headerReference w:type="first" r:id="rId12"/>
+      <w:footerReference w:type="first" r:id="rId13"/>
       <w:footnotePr>
         <w:numRestart w:val="eachSect"/>
       </w:footnotePr>

</xml_diff>